<commit_message>
Normalize citation order and reference labels
</commit_message>
<xml_diff>
--- a/output/word/When_Does_Evidence_Expansion_Help_Revised.docx
+++ b/output/word/When_Does_Evidence_Expansion_Help_Revised.docx
@@ -128,7 +128,7 @@
           <w:rFonts w:ascii="Calibri" w:hAnsi="Calibri"/>
           <w:sz w:val="22"/>
         </w:rPr>
-        <w:t>Regulatory questions often require more than a topically related passage. A valid answer may depend on a heading that fixes the applicable scope, a parent clause that identifies the responsible party, a table that supplies a numeric threshold, or a cited provision that defines a term. Retrieval-augmented systems provide external evidence and provenance for knowledge-intensive tasks [2], but a fixed retrieval strategy cannot assume that every question needs the same amount or type of expansion.</w:t>
+        <w:t>Regulatory questions often require more than a topically related passage. A valid answer may depend on a heading that fixes the applicable scope, a parent clause that identifies the responsible party, a table that supplies a numeric threshold, or a cited provision that defines a term. Retrieval-augmented systems provide external evidence and provenance for knowledge-intensive tasks [1], but a fixed retrieval strategy cannot assume that every question needs the same amount or type of expansion.</w:t>
       </w:r>
     </w:p>
     <w:p>
@@ -137,7 +137,7 @@
           <w:rFonts w:ascii="Calibri" w:hAnsi="Calibri"/>
           <w:sz w:val="22"/>
         </w:rPr>
-        <w:t>Modern pipelines commonly combine a lexical first stage with dense retrieval or neural reranking [3-5]. Adaptive retrieval methods instead decide when to retrieve or which reasoning strategy to use [6-8]. Hierarchical methods also recover context at several levels of a document [9]. These approaches motivate more flexible regulatory retrieval, but they do not remove a basic risk: additional evidence can be irrelevant, conflicting, or deceptively close to the correct rule. Prior work has shown that excessive or counterfactual context can reduce downstream accuracy [10,11]. In a regulatory setting, a passage about the wrong standard version, product, jurisdiction, threshold, or exception can do more harm than ordinary topical noise.</w:t>
+        <w:t>Modern pipelines commonly combine a lexical first stage with dense retrieval or neural reranking [2-4]. Adaptive retrieval methods instead decide when to retrieve or which reasoning strategy to use [5-7]. Hierarchical methods also recover context at several levels of a document [8]. These approaches motivate more flexible regulatory retrieval, but they do not remove a basic risk: additional evidence can be irrelevant, conflicting, or deceptively close to the correct rule. Prior work has shown that excessive or counterfactual context can reduce downstream accuracy [9,10]. In a regulatory setting, a passage about the wrong standard version, product, jurisdiction, threshold, or exception can do more harm than ordinary topical noise.</w:t>
       </w:r>
     </w:p>
     <w:p>
@@ -244,7 +244,7 @@
           <w:rFonts w:ascii="Calibri" w:hAnsi="Calibri"/>
           <w:sz w:val="22"/>
         </w:rPr>
-        <w:t>BM25 remains a strong and interpretable lexical baseline derived from the probabilistic relevance framework [1]. Dense Passage Retrieval demonstrated that learned dual encoders can outperform lexical retrieval on several open-domain question-answering benchmarks [3]. The BEIR benchmark later found that BM25 remained robust across heterogeneous zero-shot tasks, while reranking and late-interaction methods improved average effectiveness at higher computational cost [5]. Sequence-to-sequence rerankers provide another strong second stage over a bounded candidate set [4]. Our design follows this multi-stage pattern but fixes BM25 as the first stage so that later path differences remain attributable.</w:t>
+        <w:t>BM25 remains a strong and interpretable lexical baseline derived from the probabilistic relevance framework [11]. Dense Passage Retrieval demonstrated that learned dual encoders can outperform lexical retrieval on several open-domain question-answering benchmarks [2]. The BEIR benchmark later found that BM25 remained robust across heterogeneous zero-shot tasks, while reranking and late-interaction methods improved average effectiveness at higher computational cost [4]. Sequence-to-sequence rerankers provide another strong second stage over a bounded candidate set [3]. Our design follows this multi-stage pattern but fixes BM25 as the first stage so that later path differences remain attributable.</w:t>
       </w:r>
     </w:p>
     <w:p>
@@ -261,7 +261,7 @@
           <w:rFonts w:ascii="Calibri" w:hAnsi="Calibri"/>
           <w:sz w:val="22"/>
         </w:rPr>
-        <w:t>Active Retrieval Augmented Generation retrieves during long-form generation when predicted content appears uncertain [6]. Self-RAG learns retrieval and critique decisions through reflection tokens [7], and Adaptive-RAG selects among no-retrieval, single-step, and multi-step strategies using predicted question complexity [8]. RAPTOR organizes document evidence hierarchically to retrieve at different levels of abstraction [9]. Our task differs in two ways. It routes among fixed evidence-assembly paths before generation, and it uses lightweight tabular models rather than training a language-model controller. This narrower setting suits a small labeled Pilot and permits explicit path-stage comparisons.</w:t>
+        <w:t>Active Retrieval Augmented Generation retrieves during long-form generation when predicted content appears uncertain [5]. Self-RAG learns retrieval and critique decisions through reflection tokens [6], and Adaptive-RAG selects among no-retrieval, single-step, and multi-step strategies using predicted question complexity [7]. RAPTOR organizes document evidence hierarchically to retrieve at different levels of abstraction [8]. Our task differs in two ways. It routes among fixed evidence-assembly paths before generation, and it uses lightweight tabular models rather than training a language-model controller. This narrower setting suits a small labeled Pilot and permits explicit path-stage comparisons.</w:t>
       </w:r>
     </w:p>
     <w:p>
@@ -278,7 +278,7 @@
           <w:rFonts w:ascii="Calibri" w:hAnsi="Calibri"/>
           <w:sz w:val="22"/>
         </w:rPr>
-        <w:t>RAG evaluation frameworks distinguish context relevance from answer faithfulness and answer relevance [13,14]. We stop before answer generation and label the retrieved package directly. This avoids using one language model to judge another and allows annotators to identify evidence that changes the regulatory interpretation. Studies of detrimental and counterfactual contexts show why this distinction matters: more retrieved text can lower answering performance, and relevant-looking conflict can mislead a model [10,11]. Multilingual relevance assessment also shows that systems struggle to recognize when supplied passages do not support an answer [12].</w:t>
+        <w:t>RAG evaluation frameworks distinguish context relevance from answer faithfulness and answer relevance [12,13]. We stop before answer generation and label the retrieved package directly. This avoids using one language model to judge another and allows annotators to identify evidence that changes the regulatory interpretation. Studies of detrimental and counterfactual contexts show why this distinction matters: more retrieved text can lower answering performance, and relevant-looking conflict can mislead a model [9,10]. Multilingual relevance assessment also shows that systems struggle to recognize when supplied passages do not support an answer [14].</w:t>
       </w:r>
     </w:p>
     <w:p>
@@ -1239,7 +1239,7 @@
           <w:rFonts w:ascii="Calibri" w:hAnsi="Calibri"/>
           <w:sz w:val="22"/>
         </w:rPr>
-        <w:t>Primary annotation was blinded to path method names. The final freeze covered 10,385 evidence-label occurrences across 720 path outputs. A seeded, category-stratified sample of 30 complete questions received independent duplicate annotation across all six outputs and every associated evidence unit. Across 901 visible duplicate rows, exact agreement was 71.48% (95% question-cluster bootstrap interval, 66.11% to 76.85%), and Cohen's kappa was 0.556 (95% interval, 0.470 to 0.637) [21]. The adjudication queue contained 279 disagreements or harmful-reason differences, corresponding to 837 final path-level occurrences. Both original labels and the adjudication record were preserved.</w:t>
+        <w:t>Primary annotation was blinded to path method names. The final freeze covered 10,385 evidence-label occurrences across 720 path outputs. A seeded, category-stratified sample of 30 complete questions received independent duplicate annotation across all six outputs and every associated evidence unit. Across 901 visible duplicate rows, exact agreement was 71.48% (95% question-cluster bootstrap interval, 66.11% to 76.85%), and Cohen's kappa was 0.556 (95% interval, 0.470 to 0.637) [20]. The adjudication queue contained 279 disagreements or harmful-reason differences, corresponding to 837 final path-level occurrences. Both original labels and the adjudication record were preserved.</w:t>
       </w:r>
     </w:p>
     <w:p>
@@ -1334,7 +1334,7 @@
           <w:rFonts w:ascii="Calibri" w:hAnsi="Calibri"/>
           <w:sz w:val="22"/>
         </w:rPr>
-        <w:t>The learned models were L2 Logistic Regression with C = 1 and XGBoost with 100 depth-3 trees, learning rate 0.05, subsample 0.8, column subsample 0.8, and L2 regularization 1 [20]. We conducted no model or hyperparameter search.</w:t>
+        <w:t>The learned models were L2 Logistic Regression with C = 1 and XGBoost with 100 depth-3 trees, learning rate 0.05, subsample 0.8, column subsample 0.8, and L2 regularization 1 [21]. We conducted no model or hyperparameter search.</w:t>
       </w:r>
     </w:p>
     <w:p>
@@ -5669,7 +5669,7 @@
           <w:rFonts w:ascii="Calibri" w:hAnsi="Calibri"/>
           <w:sz w:val="22"/>
         </w:rPr>
-        <w:t>Adding heading, parent, and table sidecars to BM25 nearly doubled pooled combined success, from 17.50% to 33.33%, without a neural call. The gain came mainly from questions whose answer scope was structurally separated from the retrieved leaf text. This pattern aligns with hierarchical retrieval research [9], but the present result concerns attributable source context rather than generated summaries.</w:t>
+        <w:t>Adding heading, parent, and table sidecars to BM25 nearly doubled pooled combined success, from 17.50% to 33.33%, without a neural call. The gain came mainly from questions whose answer scope was structurally separated from the retrieved leaf text. This pattern aligns with hierarchical retrieval research [8], but the present result concerns attributable source context rather than generated summaries.</w:t>
       </w:r>
     </w:p>
     <w:p>
@@ -5695,7 +5695,7 @@
           <w:rFonts w:ascii="Calibri" w:hAnsi="Calibri"/>
           <w:sz w:val="22"/>
         </w:rPr>
-        <w:t>P5 retrieved the most complete evidence but did not improve combined success over P2. Reranking raised completeness while also raising the rate of harmful evidence, especially in the chemical domain. These findings resemble prior reports that detrimental or conflicting context can reduce downstream performance [10,11]. Our endpoint is stricter because one harmful unit causes path failure. The strict rule suits high-risk evidence delivery, but readers should examine completeness and harm separately when applying the findings to lower-risk tasks.</w:t>
+        <w:t>P5 retrieved the most complete evidence but did not improve combined success over P2. Reranking raised completeness while also raising the rate of harmful evidence, especially in the chemical domain. These findings resemble prior reports that detrimental or conflicting context can reduce downstream performance [9,10]. Our endpoint is stricter because one harmful unit causes path failure. The strict rule suits high-risk evidence delivery, but readers should examine completeness and harm separately when applying the findings to lower-risk tasks.</w:t>
       </w:r>
     </w:p>
     <w:p>
@@ -6478,7 +6478,367 @@
           <w:b/>
           <w:sz w:val="19"/>
         </w:rPr>
-        <w:t xml:space="preserve">1. </w:t>
+        <w:t xml:space="preserve">[1] </w:t>
+      </w:r>
+      <w:r>
+        <w:rPr>
+          <w:rFonts w:ascii="Calibri" w:hAnsi="Calibri"/>
+          <w:sz w:val="19"/>
+        </w:rPr>
+        <w:t xml:space="preserve">Lewis P, Perez E, Piktus A, et al. Retrieval-augmented generation for knowledge-intensive NLP tasks. In: </w:t>
+      </w:r>
+      <w:r>
+        <w:rPr>
+          <w:rFonts w:ascii="Calibri" w:hAnsi="Calibri"/>
+          <w:i/>
+          <w:sz w:val="19"/>
+        </w:rPr>
+        <w:t>Advances in Neural Information Processing Systems 33</w:t>
+      </w:r>
+      <w:r>
+        <w:rPr>
+          <w:rFonts w:ascii="Calibri" w:hAnsi="Calibri"/>
+          <w:sz w:val="19"/>
+        </w:rPr>
+        <w:t>. 2020.</w:t>
+      </w:r>
+    </w:p>
+    <w:p>
+      <w:pPr>
+        <w:spacing w:after="100" w:line="240" w:lineRule="auto"/>
+        <w:ind w:left="403" w:hanging="403"/>
+      </w:pPr>
+      <w:r>
+        <w:rPr>
+          <w:rFonts w:ascii="Calibri" w:hAnsi="Calibri"/>
+          <w:b/>
+          <w:sz w:val="19"/>
+        </w:rPr>
+        <w:t xml:space="preserve">[2] </w:t>
+      </w:r>
+      <w:r>
+        <w:rPr>
+          <w:rFonts w:ascii="Calibri" w:hAnsi="Calibri"/>
+          <w:sz w:val="19"/>
+        </w:rPr>
+        <w:t xml:space="preserve">Karpukhin V, Oguz B, Min S, et al. Dense passage retrieval for open-domain question answering. In: </w:t>
+      </w:r>
+      <w:r>
+        <w:rPr>
+          <w:rFonts w:ascii="Calibri" w:hAnsi="Calibri"/>
+          <w:i/>
+          <w:sz w:val="19"/>
+        </w:rPr>
+        <w:t>Proceedings of EMNLP 2020</w:t>
+      </w:r>
+      <w:r>
+        <w:rPr>
+          <w:rFonts w:ascii="Calibri" w:hAnsi="Calibri"/>
+          <w:sz w:val="19"/>
+        </w:rPr>
+        <w:t>. 2020:6769-6781. doi:10.18653/v1/2020.emnlp-main.550.</w:t>
+      </w:r>
+    </w:p>
+    <w:p>
+      <w:pPr>
+        <w:spacing w:after="100" w:line="240" w:lineRule="auto"/>
+        <w:ind w:left="403" w:hanging="403"/>
+      </w:pPr>
+      <w:r>
+        <w:rPr>
+          <w:rFonts w:ascii="Calibri" w:hAnsi="Calibri"/>
+          <w:b/>
+          <w:sz w:val="19"/>
+        </w:rPr>
+        <w:t xml:space="preserve">[3] </w:t>
+      </w:r>
+      <w:r>
+        <w:rPr>
+          <w:rFonts w:ascii="Calibri" w:hAnsi="Calibri"/>
+          <w:sz w:val="19"/>
+        </w:rPr>
+        <w:t xml:space="preserve">Nogueira R, Jiang Z, Pradeep R, Lin J. Document ranking with a pretrained sequence-to-sequence model. In: </w:t>
+      </w:r>
+      <w:r>
+        <w:rPr>
+          <w:rFonts w:ascii="Calibri" w:hAnsi="Calibri"/>
+          <w:i/>
+          <w:sz w:val="19"/>
+        </w:rPr>
+        <w:t>Findings of EMNLP 2020</w:t>
+      </w:r>
+      <w:r>
+        <w:rPr>
+          <w:rFonts w:ascii="Calibri" w:hAnsi="Calibri"/>
+          <w:sz w:val="19"/>
+        </w:rPr>
+        <w:t>. 2020:708-718. doi:10.18653/v1/2020.findings-emnlp.63.</w:t>
+      </w:r>
+    </w:p>
+    <w:p>
+      <w:pPr>
+        <w:spacing w:after="100" w:line="240" w:lineRule="auto"/>
+        <w:ind w:left="403" w:hanging="403"/>
+      </w:pPr>
+      <w:r>
+        <w:rPr>
+          <w:rFonts w:ascii="Calibri" w:hAnsi="Calibri"/>
+          <w:b/>
+          <w:sz w:val="19"/>
+        </w:rPr>
+        <w:t xml:space="preserve">[4] </w:t>
+      </w:r>
+      <w:r>
+        <w:rPr>
+          <w:rFonts w:ascii="Calibri" w:hAnsi="Calibri"/>
+          <w:sz w:val="19"/>
+        </w:rPr>
+        <w:t xml:space="preserve">Thakur N, Reimers N, Rucklé A, Srivastava A, Gurevych I. BEIR: A heterogeneous benchmark for zero-shot evaluation of information retrieval models. In: </w:t>
+      </w:r>
+      <w:r>
+        <w:rPr>
+          <w:rFonts w:ascii="Calibri" w:hAnsi="Calibri"/>
+          <w:i/>
+          <w:sz w:val="19"/>
+        </w:rPr>
+        <w:t>Advances in Neural Information Processing Systems 34</w:t>
+      </w:r>
+      <w:r>
+        <w:rPr>
+          <w:rFonts w:ascii="Calibri" w:hAnsi="Calibri"/>
+          <w:sz w:val="19"/>
+        </w:rPr>
+        <w:t>. 2021.</w:t>
+      </w:r>
+    </w:p>
+    <w:p>
+      <w:pPr>
+        <w:spacing w:after="100" w:line="240" w:lineRule="auto"/>
+        <w:ind w:left="403" w:hanging="403"/>
+      </w:pPr>
+      <w:r>
+        <w:rPr>
+          <w:rFonts w:ascii="Calibri" w:hAnsi="Calibri"/>
+          <w:b/>
+          <w:sz w:val="19"/>
+        </w:rPr>
+        <w:t xml:space="preserve">[5] </w:t>
+      </w:r>
+      <w:r>
+        <w:rPr>
+          <w:rFonts w:ascii="Calibri" w:hAnsi="Calibri"/>
+          <w:sz w:val="19"/>
+        </w:rPr>
+        <w:t xml:space="preserve">Jiang Z, Xu F, Gao L, et al. Active retrieval augmented generation. In: </w:t>
+      </w:r>
+      <w:r>
+        <w:rPr>
+          <w:rFonts w:ascii="Calibri" w:hAnsi="Calibri"/>
+          <w:i/>
+          <w:sz w:val="19"/>
+        </w:rPr>
+        <w:t>Proceedings of EMNLP 2023</w:t>
+      </w:r>
+      <w:r>
+        <w:rPr>
+          <w:rFonts w:ascii="Calibri" w:hAnsi="Calibri"/>
+          <w:sz w:val="19"/>
+        </w:rPr>
+        <w:t>. 2023:7969-7992. doi:10.18653/v1/2023.emnlp-main.495.</w:t>
+      </w:r>
+    </w:p>
+    <w:p>
+      <w:pPr>
+        <w:spacing w:after="100" w:line="240" w:lineRule="auto"/>
+        <w:ind w:left="403" w:hanging="403"/>
+      </w:pPr>
+      <w:r>
+        <w:rPr>
+          <w:rFonts w:ascii="Calibri" w:hAnsi="Calibri"/>
+          <w:b/>
+          <w:sz w:val="19"/>
+        </w:rPr>
+        <w:t xml:space="preserve">[6] </w:t>
+      </w:r>
+      <w:r>
+        <w:rPr>
+          <w:rFonts w:ascii="Calibri" w:hAnsi="Calibri"/>
+          <w:sz w:val="19"/>
+        </w:rPr>
+        <w:t xml:space="preserve">Asai A, Wu Z, Wang Y, Sil A, Hajishirzi H. Self-RAG: Learning to retrieve, generate, and critique through self-reflection. In: </w:t>
+      </w:r>
+      <w:r>
+        <w:rPr>
+          <w:rFonts w:ascii="Calibri" w:hAnsi="Calibri"/>
+          <w:i/>
+          <w:sz w:val="19"/>
+        </w:rPr>
+        <w:t>International Conference on Learning Representations</w:t>
+      </w:r>
+      <w:r>
+        <w:rPr>
+          <w:rFonts w:ascii="Calibri" w:hAnsi="Calibri"/>
+          <w:sz w:val="19"/>
+        </w:rPr>
+        <w:t>. 2024.</w:t>
+      </w:r>
+    </w:p>
+    <w:p>
+      <w:pPr>
+        <w:spacing w:after="100" w:line="240" w:lineRule="auto"/>
+        <w:ind w:left="403" w:hanging="403"/>
+      </w:pPr>
+      <w:r>
+        <w:rPr>
+          <w:rFonts w:ascii="Calibri" w:hAnsi="Calibri"/>
+          <w:b/>
+          <w:sz w:val="19"/>
+        </w:rPr>
+        <w:t xml:space="preserve">[7] </w:t>
+      </w:r>
+      <w:r>
+        <w:rPr>
+          <w:rFonts w:ascii="Calibri" w:hAnsi="Calibri"/>
+          <w:sz w:val="19"/>
+        </w:rPr>
+        <w:t xml:space="preserve">Jeong S, Baek J, Cho S, Hwang SJ, Park J. Adaptive-RAG: Learning to adapt retrieval-augmented large language models through question complexity. In: </w:t>
+      </w:r>
+      <w:r>
+        <w:rPr>
+          <w:rFonts w:ascii="Calibri" w:hAnsi="Calibri"/>
+          <w:i/>
+          <w:sz w:val="19"/>
+        </w:rPr>
+        <w:t>Proceedings of NAACL 2024</w:t>
+      </w:r>
+      <w:r>
+        <w:rPr>
+          <w:rFonts w:ascii="Calibri" w:hAnsi="Calibri"/>
+          <w:sz w:val="19"/>
+        </w:rPr>
+        <w:t>. 2024:7036-7050. doi:10.18653/v1/2024.naacl-long.389.</w:t>
+      </w:r>
+    </w:p>
+    <w:p>
+      <w:pPr>
+        <w:spacing w:after="100" w:line="240" w:lineRule="auto"/>
+        <w:ind w:left="403" w:hanging="403"/>
+      </w:pPr>
+      <w:r>
+        <w:rPr>
+          <w:rFonts w:ascii="Calibri" w:hAnsi="Calibri"/>
+          <w:b/>
+          <w:sz w:val="19"/>
+        </w:rPr>
+        <w:t xml:space="preserve">[8] </w:t>
+      </w:r>
+      <w:r>
+        <w:rPr>
+          <w:rFonts w:ascii="Calibri" w:hAnsi="Calibri"/>
+          <w:sz w:val="19"/>
+        </w:rPr>
+        <w:t xml:space="preserve">Sarthi P, Abdullah S, Tuli A, Khanna S, Goldie A, Manning CD. RAPTOR: Recursive abstractive processing for tree-organized retrieval. In: </w:t>
+      </w:r>
+      <w:r>
+        <w:rPr>
+          <w:rFonts w:ascii="Calibri" w:hAnsi="Calibri"/>
+          <w:i/>
+          <w:sz w:val="19"/>
+        </w:rPr>
+        <w:t>International Conference on Learning Representations</w:t>
+      </w:r>
+      <w:r>
+        <w:rPr>
+          <w:rFonts w:ascii="Calibri" w:hAnsi="Calibri"/>
+          <w:sz w:val="19"/>
+        </w:rPr>
+        <w:t>. 2024.</w:t>
+      </w:r>
+    </w:p>
+    <w:p>
+      <w:pPr>
+        <w:spacing w:after="100" w:line="240" w:lineRule="auto"/>
+        <w:ind w:left="403" w:hanging="403"/>
+      </w:pPr>
+      <w:r>
+        <w:rPr>
+          <w:rFonts w:ascii="Calibri" w:hAnsi="Calibri"/>
+          <w:b/>
+          <w:sz w:val="19"/>
+        </w:rPr>
+        <w:t xml:space="preserve">[9] </w:t>
+      </w:r>
+      <w:r>
+        <w:rPr>
+          <w:rFonts w:ascii="Calibri" w:hAnsi="Calibri"/>
+          <w:sz w:val="19"/>
+        </w:rPr>
+        <w:t xml:space="preserve">Oh P, Thorne J. Detrimental contexts in open-domain question answering. In: </w:t>
+      </w:r>
+      <w:r>
+        <w:rPr>
+          <w:rFonts w:ascii="Calibri" w:hAnsi="Calibri"/>
+          <w:i/>
+          <w:sz w:val="19"/>
+        </w:rPr>
+        <w:t>Findings of EMNLP 2023</w:t>
+      </w:r>
+      <w:r>
+        <w:rPr>
+          <w:rFonts w:ascii="Calibri" w:hAnsi="Calibri"/>
+          <w:sz w:val="19"/>
+        </w:rPr>
+        <w:t>. 2023:11589-11605. doi:10.18653/v1/2023.findings-emnlp.776.</w:t>
+      </w:r>
+    </w:p>
+    <w:p>
+      <w:pPr>
+        <w:spacing w:after="100" w:line="240" w:lineRule="auto"/>
+        <w:ind w:left="403" w:hanging="403"/>
+      </w:pPr>
+      <w:r>
+        <w:rPr>
+          <w:rFonts w:ascii="Calibri" w:hAnsi="Calibri"/>
+          <w:b/>
+          <w:sz w:val="19"/>
+        </w:rPr>
+        <w:t xml:space="preserve">[10] </w:t>
+      </w:r>
+      <w:r>
+        <w:rPr>
+          <w:rFonts w:ascii="Calibri" w:hAnsi="Calibri"/>
+          <w:sz w:val="19"/>
+        </w:rPr>
+        <w:t xml:space="preserve">Hong G, Kim J, Kang J, Myaeng SH, Whang JJ. Why so gullible? Enhancing the robustness of retrieval-augmented models against counterfactual noise. In: </w:t>
+      </w:r>
+      <w:r>
+        <w:rPr>
+          <w:rFonts w:ascii="Calibri" w:hAnsi="Calibri"/>
+          <w:i/>
+          <w:sz w:val="19"/>
+        </w:rPr>
+        <w:t>Findings of NAACL 2024</w:t>
+      </w:r>
+      <w:r>
+        <w:rPr>
+          <w:rFonts w:ascii="Calibri" w:hAnsi="Calibri"/>
+          <w:sz w:val="19"/>
+        </w:rPr>
+        <w:t>. 2024:2474-2495. doi:10.18653/v1/2024.findings-naacl.159.</w:t>
+      </w:r>
+    </w:p>
+    <w:p>
+      <w:pPr>
+        <w:spacing w:after="100" w:line="240" w:lineRule="auto"/>
+        <w:ind w:left="403" w:hanging="403"/>
+      </w:pPr>
+      <w:r>
+        <w:rPr>
+          <w:rFonts w:ascii="Calibri" w:hAnsi="Calibri"/>
+          <w:b/>
+          <w:sz w:val="19"/>
+        </w:rPr>
+        <w:t xml:space="preserve">[11] </w:t>
       </w:r>
       <w:r>
         <w:rPr>
@@ -6514,14 +6874,14 @@
           <w:b/>
           <w:sz w:val="19"/>
         </w:rPr>
-        <w:t xml:space="preserve">2. </w:t>
+        <w:t xml:space="preserve">[12] </w:t>
       </w:r>
       <w:r>
         <w:rPr>
           <w:rFonts w:ascii="Calibri" w:hAnsi="Calibri"/>
           <w:sz w:val="19"/>
         </w:rPr>
-        <w:t xml:space="preserve">Lewis P, Perez E, Piktus A, et al. Retrieval-augmented generation for knowledge-intensive NLP tasks. In: </w:t>
+        <w:t xml:space="preserve">Es S, James J, Espinosa Anke L, Schockaert S. RAGAs: Automated evaluation of retrieval augmented generation. In: </w:t>
       </w:r>
       <w:r>
         <w:rPr>
@@ -6529,14 +6889,14 @@
           <w:i/>
           <w:sz w:val="19"/>
         </w:rPr>
-        <w:t>Advances in Neural Information Processing Systems 33</w:t>
+        <w:t>Proceedings of EACL 2024: System Demonstrations</w:t>
       </w:r>
       <w:r>
         <w:rPr>
           <w:rFonts w:ascii="Calibri" w:hAnsi="Calibri"/>
           <w:sz w:val="19"/>
         </w:rPr>
-        <w:t>. 2020.</w:t>
+        <w:t>. 2024:150-158. doi:10.18653/v1/2024.eacl-demo.16.</w:t>
       </w:r>
     </w:p>
     <w:p>
@@ -6550,194 +6910,14 @@
           <w:b/>
           <w:sz w:val="19"/>
         </w:rPr>
-        <w:t xml:space="preserve">3. </w:t>
+        <w:t xml:space="preserve">[13] </w:t>
       </w:r>
       <w:r>
         <w:rPr>
           <w:rFonts w:ascii="Calibri" w:hAnsi="Calibri"/>
           <w:sz w:val="19"/>
         </w:rPr>
-        <w:t xml:space="preserve">Karpukhin V, Oguz B, Min S, et al. Dense passage retrieval for open-domain question answering. In: </w:t>
-      </w:r>
-      <w:r>
-        <w:rPr>
-          <w:rFonts w:ascii="Calibri" w:hAnsi="Calibri"/>
-          <w:i/>
-          <w:sz w:val="19"/>
-        </w:rPr>
-        <w:t>Proceedings of EMNLP 2020</w:t>
-      </w:r>
-      <w:r>
-        <w:rPr>
-          <w:rFonts w:ascii="Calibri" w:hAnsi="Calibri"/>
-          <w:sz w:val="19"/>
-        </w:rPr>
-        <w:t>. 2020:6769-6781. doi:10.18653/v1/2020.emnlp-main.550.</w:t>
-      </w:r>
-    </w:p>
-    <w:p>
-      <w:pPr>
-        <w:spacing w:after="100" w:line="240" w:lineRule="auto"/>
-        <w:ind w:left="403" w:hanging="403"/>
-      </w:pPr>
-      <w:r>
-        <w:rPr>
-          <w:rFonts w:ascii="Calibri" w:hAnsi="Calibri"/>
-          <w:b/>
-          <w:sz w:val="19"/>
-        </w:rPr>
-        <w:t xml:space="preserve">4. </w:t>
-      </w:r>
-      <w:r>
-        <w:rPr>
-          <w:rFonts w:ascii="Calibri" w:hAnsi="Calibri"/>
-          <w:sz w:val="19"/>
-        </w:rPr>
-        <w:t xml:space="preserve">Nogueira R, Jiang Z, Pradeep R, Lin J. Document ranking with a pretrained sequence-to-sequence model. In: </w:t>
-      </w:r>
-      <w:r>
-        <w:rPr>
-          <w:rFonts w:ascii="Calibri" w:hAnsi="Calibri"/>
-          <w:i/>
-          <w:sz w:val="19"/>
-        </w:rPr>
-        <w:t>Findings of EMNLP 2020</w:t>
-      </w:r>
-      <w:r>
-        <w:rPr>
-          <w:rFonts w:ascii="Calibri" w:hAnsi="Calibri"/>
-          <w:sz w:val="19"/>
-        </w:rPr>
-        <w:t>. 2020:708-718. doi:10.18653/v1/2020.findings-emnlp.63.</w:t>
-      </w:r>
-    </w:p>
-    <w:p>
-      <w:pPr>
-        <w:spacing w:after="100" w:line="240" w:lineRule="auto"/>
-        <w:ind w:left="403" w:hanging="403"/>
-      </w:pPr>
-      <w:r>
-        <w:rPr>
-          <w:rFonts w:ascii="Calibri" w:hAnsi="Calibri"/>
-          <w:b/>
-          <w:sz w:val="19"/>
-        </w:rPr>
-        <w:t xml:space="preserve">5. </w:t>
-      </w:r>
-      <w:r>
-        <w:rPr>
-          <w:rFonts w:ascii="Calibri" w:hAnsi="Calibri"/>
-          <w:sz w:val="19"/>
-        </w:rPr>
-        <w:t xml:space="preserve">Thakur N, Reimers N, Rucklé A, Srivastava A, Gurevych I. BEIR: A heterogeneous benchmark for zero-shot evaluation of information retrieval models. In: </w:t>
-      </w:r>
-      <w:r>
-        <w:rPr>
-          <w:rFonts w:ascii="Calibri" w:hAnsi="Calibri"/>
-          <w:i/>
-          <w:sz w:val="19"/>
-        </w:rPr>
-        <w:t>Advances in Neural Information Processing Systems 34</w:t>
-      </w:r>
-      <w:r>
-        <w:rPr>
-          <w:rFonts w:ascii="Calibri" w:hAnsi="Calibri"/>
-          <w:sz w:val="19"/>
-        </w:rPr>
-        <w:t>. 2021.</w:t>
-      </w:r>
-    </w:p>
-    <w:p>
-      <w:pPr>
-        <w:spacing w:after="100" w:line="240" w:lineRule="auto"/>
-        <w:ind w:left="403" w:hanging="403"/>
-      </w:pPr>
-      <w:r>
-        <w:rPr>
-          <w:rFonts w:ascii="Calibri" w:hAnsi="Calibri"/>
-          <w:b/>
-          <w:sz w:val="19"/>
-        </w:rPr>
-        <w:t xml:space="preserve">6. </w:t>
-      </w:r>
-      <w:r>
-        <w:rPr>
-          <w:rFonts w:ascii="Calibri" w:hAnsi="Calibri"/>
-          <w:sz w:val="19"/>
-        </w:rPr>
-        <w:t xml:space="preserve">Jiang Z, Xu F, Gao L, et al. Active retrieval augmented generation. In: </w:t>
-      </w:r>
-      <w:r>
-        <w:rPr>
-          <w:rFonts w:ascii="Calibri" w:hAnsi="Calibri"/>
-          <w:i/>
-          <w:sz w:val="19"/>
-        </w:rPr>
-        <w:t>Proceedings of EMNLP 2023</w:t>
-      </w:r>
-      <w:r>
-        <w:rPr>
-          <w:rFonts w:ascii="Calibri" w:hAnsi="Calibri"/>
-          <w:sz w:val="19"/>
-        </w:rPr>
-        <w:t>. 2023:7969-7992. doi:10.18653/v1/2023.emnlp-main.495.</w:t>
-      </w:r>
-    </w:p>
-    <w:p>
-      <w:pPr>
-        <w:spacing w:after="100" w:line="240" w:lineRule="auto"/>
-        <w:ind w:left="403" w:hanging="403"/>
-      </w:pPr>
-      <w:r>
-        <w:rPr>
-          <w:rFonts w:ascii="Calibri" w:hAnsi="Calibri"/>
-          <w:b/>
-          <w:sz w:val="19"/>
-        </w:rPr>
-        <w:t xml:space="preserve">7. </w:t>
-      </w:r>
-      <w:r>
-        <w:rPr>
-          <w:rFonts w:ascii="Calibri" w:hAnsi="Calibri"/>
-          <w:sz w:val="19"/>
-        </w:rPr>
-        <w:t xml:space="preserve">Asai A, Wu Z, Wang Y, Sil A, Hajishirzi H. Self-RAG: Learning to retrieve, generate, and critique through self-reflection. In: </w:t>
-      </w:r>
-      <w:r>
-        <w:rPr>
-          <w:rFonts w:ascii="Calibri" w:hAnsi="Calibri"/>
-          <w:i/>
-          <w:sz w:val="19"/>
-        </w:rPr>
-        <w:t>International Conference on Learning Representations</w:t>
-      </w:r>
-      <w:r>
-        <w:rPr>
-          <w:rFonts w:ascii="Calibri" w:hAnsi="Calibri"/>
-          <w:sz w:val="19"/>
-        </w:rPr>
-        <w:t>. 2024.</w:t>
-      </w:r>
-    </w:p>
-    <w:p>
-      <w:pPr>
-        <w:spacing w:after="100" w:line="240" w:lineRule="auto"/>
-        <w:ind w:left="403" w:hanging="403"/>
-      </w:pPr>
-      <w:r>
-        <w:rPr>
-          <w:rFonts w:ascii="Calibri" w:hAnsi="Calibri"/>
-          <w:b/>
-          <w:sz w:val="19"/>
-        </w:rPr>
-        <w:t xml:space="preserve">8. </w:t>
-      </w:r>
-      <w:r>
-        <w:rPr>
-          <w:rFonts w:ascii="Calibri" w:hAnsi="Calibri"/>
-          <w:sz w:val="19"/>
-        </w:rPr>
-        <w:t xml:space="preserve">Jeong S, Baek J, Cho S, Hwang SJ, Park J. Adaptive-RAG: Learning to adapt retrieval-augmented large language models through question complexity. In: </w:t>
+        <w:t xml:space="preserve">Saad-Falcon J, Khattab O, Potts C, Zaharia M. ARES: An automated evaluation framework for retrieval-augmented generation systems. In: </w:t>
       </w:r>
       <w:r>
         <w:rPr>
@@ -6752,7 +6932,7 @@
           <w:rFonts w:ascii="Calibri" w:hAnsi="Calibri"/>
           <w:sz w:val="19"/>
         </w:rPr>
-        <w:t>. 2024:7036-7050. doi:10.18653/v1/2024.naacl-long.389.</w:t>
+        <w:t>. 2024:338-354. doi:10.18653/v1/2024.naacl-long.20.</w:t>
       </w:r>
     </w:p>
     <w:p>
@@ -6766,115 +6946,7 @@
           <w:b/>
           <w:sz w:val="19"/>
         </w:rPr>
-        <w:t xml:space="preserve">9. </w:t>
-      </w:r>
-      <w:r>
-        <w:rPr>
-          <w:rFonts w:ascii="Calibri" w:hAnsi="Calibri"/>
-          <w:sz w:val="19"/>
-        </w:rPr>
-        <w:t xml:space="preserve">Sarthi P, Abdullah S, Tuli A, Khanna S, Goldie A, Manning CD. RAPTOR: Recursive abstractive processing for tree-organized retrieval. In: </w:t>
-      </w:r>
-      <w:r>
-        <w:rPr>
-          <w:rFonts w:ascii="Calibri" w:hAnsi="Calibri"/>
-          <w:i/>
-          <w:sz w:val="19"/>
-        </w:rPr>
-        <w:t>International Conference on Learning Representations</w:t>
-      </w:r>
-      <w:r>
-        <w:rPr>
-          <w:rFonts w:ascii="Calibri" w:hAnsi="Calibri"/>
-          <w:sz w:val="19"/>
-        </w:rPr>
-        <w:t>. 2024.</w:t>
-      </w:r>
-    </w:p>
-    <w:p>
-      <w:pPr>
-        <w:spacing w:after="100" w:line="240" w:lineRule="auto"/>
-        <w:ind w:left="403" w:hanging="403"/>
-      </w:pPr>
-      <w:r>
-        <w:rPr>
-          <w:rFonts w:ascii="Calibri" w:hAnsi="Calibri"/>
-          <w:b/>
-          <w:sz w:val="19"/>
-        </w:rPr>
-        <w:t xml:space="preserve">10. </w:t>
-      </w:r>
-      <w:r>
-        <w:rPr>
-          <w:rFonts w:ascii="Calibri" w:hAnsi="Calibri"/>
-          <w:sz w:val="19"/>
-        </w:rPr>
-        <w:t xml:space="preserve">Oh P, Thorne J. Detrimental contexts in open-domain question answering. In: </w:t>
-      </w:r>
-      <w:r>
-        <w:rPr>
-          <w:rFonts w:ascii="Calibri" w:hAnsi="Calibri"/>
-          <w:i/>
-          <w:sz w:val="19"/>
-        </w:rPr>
-        <w:t>Findings of EMNLP 2023</w:t>
-      </w:r>
-      <w:r>
-        <w:rPr>
-          <w:rFonts w:ascii="Calibri" w:hAnsi="Calibri"/>
-          <w:sz w:val="19"/>
-        </w:rPr>
-        <w:t>. 2023:11589-11605. doi:10.18653/v1/2023.findings-emnlp.776.</w:t>
-      </w:r>
-    </w:p>
-    <w:p>
-      <w:pPr>
-        <w:spacing w:after="100" w:line="240" w:lineRule="auto"/>
-        <w:ind w:left="403" w:hanging="403"/>
-      </w:pPr>
-      <w:r>
-        <w:rPr>
-          <w:rFonts w:ascii="Calibri" w:hAnsi="Calibri"/>
-          <w:b/>
-          <w:sz w:val="19"/>
-        </w:rPr>
-        <w:t xml:space="preserve">11. </w:t>
-      </w:r>
-      <w:r>
-        <w:rPr>
-          <w:rFonts w:ascii="Calibri" w:hAnsi="Calibri"/>
-          <w:sz w:val="19"/>
-        </w:rPr>
-        <w:t xml:space="preserve">Hong G, Kim J, Kang J, Myaeng SH, Whang JJ. Why so gullible? Enhancing the robustness of retrieval-augmented models against counterfactual noise. In: </w:t>
-      </w:r>
-      <w:r>
-        <w:rPr>
-          <w:rFonts w:ascii="Calibri" w:hAnsi="Calibri"/>
-          <w:i/>
-          <w:sz w:val="19"/>
-        </w:rPr>
-        <w:t>Findings of NAACL 2024</w:t>
-      </w:r>
-      <w:r>
-        <w:rPr>
-          <w:rFonts w:ascii="Calibri" w:hAnsi="Calibri"/>
-          <w:sz w:val="19"/>
-        </w:rPr>
-        <w:t>. 2024:2474-2495. doi:10.18653/v1/2024.findings-naacl.159.</w:t>
-      </w:r>
-    </w:p>
-    <w:p>
-      <w:pPr>
-        <w:spacing w:after="100" w:line="240" w:lineRule="auto"/>
-        <w:ind w:left="403" w:hanging="403"/>
-      </w:pPr>
-      <w:r>
-        <w:rPr>
-          <w:rFonts w:ascii="Calibri" w:hAnsi="Calibri"/>
-          <w:b/>
-          <w:sz w:val="19"/>
-        </w:rPr>
-        <w:t xml:space="preserve">12. </w:t>
+        <w:t xml:space="preserve">[14] </w:t>
       </w:r>
       <w:r>
         <w:rPr>
@@ -6910,79 +6982,7 @@
           <w:b/>
           <w:sz w:val="19"/>
         </w:rPr>
-        <w:t xml:space="preserve">13. </w:t>
-      </w:r>
-      <w:r>
-        <w:rPr>
-          <w:rFonts w:ascii="Calibri" w:hAnsi="Calibri"/>
-          <w:sz w:val="19"/>
-        </w:rPr>
-        <w:t xml:space="preserve">Es S, James J, Espinosa Anke L, Schockaert S. RAGAs: Automated evaluation of retrieval augmented generation. In: </w:t>
-      </w:r>
-      <w:r>
-        <w:rPr>
-          <w:rFonts w:ascii="Calibri" w:hAnsi="Calibri"/>
-          <w:i/>
-          <w:sz w:val="19"/>
-        </w:rPr>
-        <w:t>Proceedings of EACL 2024: System Demonstrations</w:t>
-      </w:r>
-      <w:r>
-        <w:rPr>
-          <w:rFonts w:ascii="Calibri" w:hAnsi="Calibri"/>
-          <w:sz w:val="19"/>
-        </w:rPr>
-        <w:t>. 2024:150-158. doi:10.18653/v1/2024.eacl-demo.16.</w:t>
-      </w:r>
-    </w:p>
-    <w:p>
-      <w:pPr>
-        <w:spacing w:after="100" w:line="240" w:lineRule="auto"/>
-        <w:ind w:left="403" w:hanging="403"/>
-      </w:pPr>
-      <w:r>
-        <w:rPr>
-          <w:rFonts w:ascii="Calibri" w:hAnsi="Calibri"/>
-          <w:b/>
-          <w:sz w:val="19"/>
-        </w:rPr>
-        <w:t xml:space="preserve">14. </w:t>
-      </w:r>
-      <w:r>
-        <w:rPr>
-          <w:rFonts w:ascii="Calibri" w:hAnsi="Calibri"/>
-          <w:sz w:val="19"/>
-        </w:rPr>
-        <w:t xml:space="preserve">Saad-Falcon J, Khattab O, Potts C, Zaharia M. ARES: An automated evaluation framework for retrieval-augmented generation systems. In: </w:t>
-      </w:r>
-      <w:r>
-        <w:rPr>
-          <w:rFonts w:ascii="Calibri" w:hAnsi="Calibri"/>
-          <w:i/>
-          <w:sz w:val="19"/>
-        </w:rPr>
-        <w:t>Proceedings of NAACL 2024</w:t>
-      </w:r>
-      <w:r>
-        <w:rPr>
-          <w:rFonts w:ascii="Calibri" w:hAnsi="Calibri"/>
-          <w:sz w:val="19"/>
-        </w:rPr>
-        <w:t>. 2024:338-354. doi:10.18653/v1/2024.naacl-long.20.</w:t>
-      </w:r>
-    </w:p>
-    <w:p>
-      <w:pPr>
-        <w:spacing w:after="100" w:line="240" w:lineRule="auto"/>
-        <w:ind w:left="403" w:hanging="403"/>
-      </w:pPr>
-      <w:r>
-        <w:rPr>
-          <w:rFonts w:ascii="Calibri" w:hAnsi="Calibri"/>
-          <w:b/>
-          <w:sz w:val="19"/>
-        </w:rPr>
-        <w:t xml:space="preserve">15. </w:t>
+        <w:t xml:space="preserve">[15] </w:t>
       </w:r>
       <w:r>
         <w:rPr>
@@ -7018,7 +7018,7 @@
           <w:b/>
           <w:sz w:val="19"/>
         </w:rPr>
-        <w:t xml:space="preserve">16. </w:t>
+        <w:t xml:space="preserve">[16] </w:t>
       </w:r>
       <w:r>
         <w:rPr>
@@ -7054,7 +7054,7 @@
           <w:b/>
           <w:sz w:val="19"/>
         </w:rPr>
-        <w:t xml:space="preserve">17. </w:t>
+        <w:t xml:space="preserve">[17] </w:t>
       </w:r>
       <w:r>
         <w:rPr>
@@ -7090,7 +7090,7 @@
           <w:b/>
           <w:sz w:val="19"/>
         </w:rPr>
-        <w:t xml:space="preserve">18. </w:t>
+        <w:t xml:space="preserve">[18] </w:t>
       </w:r>
       <w:r>
         <w:rPr>
@@ -7126,7 +7126,7 @@
           <w:b/>
           <w:sz w:val="19"/>
         </w:rPr>
-        <w:t xml:space="preserve">19. </w:t>
+        <w:t xml:space="preserve">[19] </w:t>
       </w:r>
       <w:r>
         <w:rPr>
@@ -7162,7 +7162,43 @@
           <w:b/>
           <w:sz w:val="19"/>
         </w:rPr>
-        <w:t xml:space="preserve">20. </w:t>
+        <w:t xml:space="preserve">[20] </w:t>
+      </w:r>
+      <w:r>
+        <w:rPr>
+          <w:rFonts w:ascii="Calibri" w:hAnsi="Calibri"/>
+          <w:sz w:val="19"/>
+        </w:rPr>
+        <w:t xml:space="preserve">Cohen J. A coefficient of agreement for nominal scales. </w:t>
+      </w:r>
+      <w:r>
+        <w:rPr>
+          <w:rFonts w:ascii="Calibri" w:hAnsi="Calibri"/>
+          <w:i/>
+          <w:sz w:val="19"/>
+        </w:rPr>
+        <w:t>Educational and Psychological Measurement</w:t>
+      </w:r>
+      <w:r>
+        <w:rPr>
+          <w:rFonts w:ascii="Calibri" w:hAnsi="Calibri"/>
+          <w:sz w:val="19"/>
+        </w:rPr>
+        <w:t>. 1960;20(1):37-46. doi:10.1177/001316446002000104.</w:t>
+      </w:r>
+    </w:p>
+    <w:p>
+      <w:pPr>
+        <w:spacing w:after="100" w:line="240" w:lineRule="auto"/>
+        <w:ind w:left="403" w:hanging="403"/>
+      </w:pPr>
+      <w:r>
+        <w:rPr>
+          <w:rFonts w:ascii="Calibri" w:hAnsi="Calibri"/>
+          <w:b/>
+          <w:sz w:val="19"/>
+        </w:rPr>
+        <w:t xml:space="preserve">[21] </w:t>
       </w:r>
       <w:r>
         <w:rPr>
@@ -7198,43 +7234,7 @@
           <w:b/>
           <w:sz w:val="19"/>
         </w:rPr>
-        <w:t xml:space="preserve">21. </w:t>
-      </w:r>
-      <w:r>
-        <w:rPr>
-          <w:rFonts w:ascii="Calibri" w:hAnsi="Calibri"/>
-          <w:sz w:val="19"/>
-        </w:rPr>
-        <w:t xml:space="preserve">Cohen J. A coefficient of agreement for nominal scales. </w:t>
-      </w:r>
-      <w:r>
-        <w:rPr>
-          <w:rFonts w:ascii="Calibri" w:hAnsi="Calibri"/>
-          <w:i/>
-          <w:sz w:val="19"/>
-        </w:rPr>
-        <w:t>Educational and Psychological Measurement</w:t>
-      </w:r>
-      <w:r>
-        <w:rPr>
-          <w:rFonts w:ascii="Calibri" w:hAnsi="Calibri"/>
-          <w:sz w:val="19"/>
-        </w:rPr>
-        <w:t>. 1960;20(1):37-46. doi:10.1177/001316446002000104.</w:t>
-      </w:r>
-    </w:p>
-    <w:p>
-      <w:pPr>
-        <w:spacing w:after="100" w:line="240" w:lineRule="auto"/>
-        <w:ind w:left="403" w:hanging="403"/>
-      </w:pPr>
-      <w:r>
-        <w:rPr>
-          <w:rFonts w:ascii="Calibri" w:hAnsi="Calibri"/>
-          <w:b/>
-          <w:sz w:val="19"/>
-        </w:rPr>
-        <w:t xml:space="preserve">22. </w:t>
+        <w:t xml:space="preserve">[22] </w:t>
       </w:r>
       <w:r>
         <w:rPr>
@@ -7270,7 +7270,7 @@
           <w:b/>
           <w:sz w:val="19"/>
         </w:rPr>
-        <w:t xml:space="preserve">23. </w:t>
+        <w:t xml:space="preserve">[23] </w:t>
       </w:r>
       <w:r>
         <w:rPr>

</xml_diff>